<commit_message>
Chapter IV draft: Figure 48 part labels confirmed
Co-Authored-By: Claude Opus 5.5 <noreply@anthropic.com>
Claude-Session: https://claude.ai/code/session_015tiHLAeezxpna9r941WZYy
</commit_message>
<xml_diff>
--- a/Documents/Chapter 4/Chapter 4 Draft.docx
+++ b/Documents/Chapter 4/Chapter 4 Draft.docx
@@ -411,7 +411,7 @@
         <w:t xml:space="preserve"> </w:t>
       </w:r>
       <w:r>
-        <w:t xml:space="preserve">(a) Back of the 7-inch 1024 x 600 HDMI touchscreen, mounted on the door; (b) USB case fan; (c) Raspberry Pi 5 board stack (CONFIRM: Raspberry Pi 5 with the NVMe HAT on top); (d) Waveshare UPS HAT (E) with four 21700 lithium-ion cells; (e) passive buzzer module; (f) 2-in-1 Ethernet and power cable to the camera; (g) power adapters (CONFIRM which); (h) CONFIRM: the black unit with the red display.</w:t>
+        <w:t xml:space="preserve">(a) Back of the 7-inch 1024 x 600 HDMI touchscreen, mounted on the door; (b) USB fan; (c) board stack, from top to bottom: NVMe HAT, Raspberry Pi 5 with the Active Cooler, and Waveshare UPS HAT (E); (d) the four 21700 lithium-ion cells of the UPS HAT (E); (e) passive buzzer module; (f) 2-in-1 Ethernet and power cable to the camera; (g) official Raspberry Pi 27 W (5.1 V, 5 A) power adapter, plugged into the AC mains extension; (h) 5 V to 12 V USB to DC barrel jack step-up cable for the camera, connected to a USB hub.</w:t>
       </w:r>
     </w:p>
     <w:p>
@@ -546,7 +546,7 @@
         <w:pStyle w:val="BodyText"/>
       </w:pPr>
       <w:r>
-        <w:t xml:space="preserve">The Hikvision HiWatch HWI-B140H sends its video over RTSP through an Ethernet cable connected directly to the Raspberry Pi 5. The camera is powered from the UPS HAT through a 5 V to 12 V step-up cable and a 2-in-1 Ethernet and power cable, so the camera and the Raspberry Pi share one battery. The camera has two streams. The main stream, used for detection, was set to 1280 x 720 at 15 frames per second with H.264 encoding. The sub-stream, at 640 x 360, is kept as a fallback. The main stream at 1920 x 1080 was also tried, but the Raspberry Pi could not decode it fast enough and the picture fell six to seven seconds behind, so 1280 x 720 was chosen. At that setting the picture on the touchscreen was about one second behind the scene.</w:t>
+        <w:t xml:space="preserve">The Hikvision HiWatch HWI-B140H sends its video over RTSP through an Ethernet cable connected directly to the Raspberry Pi 5. The camera is powered from the UPS HAT through a USB hub, a 5 V to 12 V step-up cable and a 2-in-1 Ethernet and power cable, so the camera and the Raspberry Pi share one battery. The camera has two streams. The main stream, used for detection, was set to 1280 x 720 at 15 frames per second with H.264 encoding. The sub-stream, at 640 x 360, is kept as a fallback. The main stream at 1920 x 1080 was also tried, but the Raspberry Pi could not decode it fast enough and the picture fell six to seven seconds behind, so 1280 x 720 was chosen. At that setting the picture on the touchscreen was about one second behind the scene.</w:t>
       </w:r>
     </w:p>
     <w:p>

</xml_diff>

<commit_message>
Chapter IV draft: Figure 47 note, cable entry order corrected
Co-Authored-By: Claude Sonnet 5.5 <noreply@anthropic.com>
Claude-Session: https://claude.ai/code/session_015tiHLAeezxpna9r941WZYy
</commit_message>
<xml_diff>
--- a/Documents/Chapter 4/Chapter 4 Draft.docx
+++ b/Documents/Chapter 4/Chapter 4 Draft.docx
@@ -259,14 +259,14 @@
       <w:r>
         <w:drawing>
           <wp:inline>
-            <wp:extent cx="5334000" cy="5386603"/>
+            <wp:extent cx="5334000" cy="5445751"/>
             <wp:effectExtent b="0" l="0" r="0" t="0"/>
             <wp:docPr descr="" title="" id="25" name="Picture"/>
             <a:graphic>
               <a:graphicData uri="http://schemas.openxmlformats.org/drawingml/2006/picture">
                 <pic:pic>
                   <pic:nvPicPr>
-                    <pic:cNvPr descr="Figures/Fig_unit_side_old.jpg" id="26" name="Picture"/>
+                    <pic:cNvPr descr="Figures/Fig_unit_side.jpg" id="26" name="Picture"/>
                     <pic:cNvPicPr>
                       <a:picLocks noChangeArrowheads="1" noChangeAspect="1"/>
                     </pic:cNvPicPr>
@@ -280,7 +280,7 @@
                   <pic:spPr bwMode="auto">
                     <a:xfrm>
                       <a:off x="0" y="0"/>
-                      <a:ext cx="5334000" cy="5386603"/>
+                      <a:ext cx="5334000" cy="5445751"/>
                     </a:xfrm>
                     <a:prstGeom prst="rect">
                       <a:avLst/>
@@ -314,7 +314,7 @@
         <w:t xml:space="preserve"> </w:t>
       </w:r>
       <w:r>
-        <w:t xml:space="preserve">This photograph was taken before the third cable entry was added. The finished enclosure has three entries: the mains lead, the camera cable, and the cable to the Wi-Fi repeater. CONFIRM: replace this photograph with a current one showing all three entries.</w:t>
+        <w:t xml:space="preserve">The three cable entries, from left to right: the Ethernet cable to the Wi-Fi extender, the 2-in-1 Ethernet and power cable to the camera, and the AC mains extension cable. The coil in the foreground is the camera cable.</w:t>
       </w:r>
     </w:p>
     <w:p>

</xml_diff>